<commit_message>
feat: modificacion y configuracion del word y pdf del EA
</commit_message>
<xml_diff>
--- a/plantilla/Adverse Events.docx
+++ b/plantilla/Adverse Events.docx
@@ -513,7 +513,7 @@
                 <w:szCs w:val="16"/>
                 <w:lang w:val="en-GB"/>
               </w:rPr>
-              <w:t>Patient Support</w:t>
+              <w:t>Patient Support PSP-L-0017</w:t>
             </w:r>
             <w:r>
               <w:rPr>
@@ -3421,7 +3421,6 @@
                 <w:u w:val="single"/>
               </w:rPr>
             </w:pPr>
-            <w:proofErr w:type="gramStart"/>
             <w:r>
               <w:rPr>
                 <w:rFonts w:ascii="Times New Roman" w:hAnsi="Times New Roman" w:cs="Times New Roman"/>
@@ -3438,17 +3437,7 @@
                 <w:szCs w:val="16"/>
                 <w:u w:val="single"/>
               </w:rPr>
-              <w:t>Event</w:t>
-            </w:r>
-            <w:proofErr w:type="gramEnd"/>
-            <w:r>
-              <w:rPr>
-                <w:rFonts w:ascii="Times New Roman" w:hAnsi="Times New Roman" w:cs="Times New Roman"/>
-                <w:sz w:val="16"/>
-                <w:szCs w:val="16"/>
-                <w:u w:val="single"/>
-              </w:rPr>
-              <w:t xml:space="preserve"> </w:t>
+              <w:t xml:space="preserve">Event </w:t>
             </w:r>
             <w:r>
               <w:rPr>
@@ -3654,7 +3643,6 @@
                 <w:szCs w:val="16"/>
               </w:rPr>
             </w:pPr>
-            <w:proofErr w:type="gramStart"/>
             <w:r>
               <w:rPr>
                 <w:rFonts w:ascii="Times New Roman" w:hAnsi="Times New Roman" w:cs="Times New Roman"/>
@@ -3670,17 +3658,7 @@
                 <w:szCs w:val="16"/>
                 <w:u w:val="single"/>
               </w:rPr>
-              <w:t>Has</w:t>
-            </w:r>
-            <w:proofErr w:type="gramEnd"/>
-            <w:r>
-              <w:rPr>
-                <w:rFonts w:ascii="Times New Roman" w:hAnsi="Times New Roman" w:cs="Times New Roman"/>
-                <w:sz w:val="16"/>
-                <w:szCs w:val="16"/>
-                <w:u w:val="single"/>
-              </w:rPr>
-              <w:t xml:space="preserve"> this drug </w:t>
+              <w:t xml:space="preserve">Has this drug </w:t>
             </w:r>
             <w:r>
               <w:rPr>
@@ -3887,7 +3865,6 @@
                 <w:u w:val="single"/>
               </w:rPr>
             </w:pPr>
-            <w:proofErr w:type="gramStart"/>
             <w:r>
               <w:rPr>
                 <w:rFonts w:ascii="Times New Roman" w:hAnsi="Times New Roman" w:cs="Times New Roman"/>
@@ -3904,18 +3881,7 @@
                 <w:szCs w:val="16"/>
                 <w:u w:val="single"/>
               </w:rPr>
-              <w:t>Seriousness</w:t>
-            </w:r>
-            <w:proofErr w:type="gramEnd"/>
-            <w:r>
-              <w:rPr>
-                <w:rFonts w:ascii="Times New Roman" w:hAnsi="Times New Roman" w:cs="Times New Roman"/>
-                <w:b/>
-                <w:sz w:val="16"/>
-                <w:szCs w:val="16"/>
-                <w:u w:val="single"/>
-              </w:rPr>
-              <w:t xml:space="preserve"> of the event per Reporter</w:t>
+              <w:t>Seriousness of the event per Reporter</w:t>
             </w:r>
             <w:r>
               <w:rPr>
@@ -4358,9 +4324,16 @@
                 <w:sz w:val="16"/>
                 <w:szCs w:val="16"/>
               </w:rPr>
-              <w:t xml:space="preserve">Inpatient </w:t>
-            </w:r>
-            <w:proofErr w:type="spellStart"/>
+              <w:t>Inpatient hospitalisation or prolongation of existing</w:t>
+            </w:r>
+            <w:r>
+              <w:rPr>
+                <w:rFonts w:ascii="Times New Roman" w:hAnsi="Times New Roman" w:cs="Times New Roman"/>
+                <w:sz w:val="16"/>
+                <w:szCs w:val="16"/>
+              </w:rPr>
+              <w:t xml:space="preserve"> </w:t>
+            </w:r>
             <w:r>
               <w:rPr>
                 <w:rFonts w:ascii="Times New Roman" w:hAnsi="Times New Roman" w:cs="Times New Roman"/>
@@ -4369,33 +4342,6 @@
               </w:rPr>
               <w:t>hospitalisation</w:t>
             </w:r>
-            <w:proofErr w:type="spellEnd"/>
-            <w:r>
-              <w:rPr>
-                <w:rFonts w:ascii="Times New Roman" w:hAnsi="Times New Roman" w:cs="Times New Roman"/>
-                <w:sz w:val="16"/>
-                <w:szCs w:val="16"/>
-              </w:rPr>
-              <w:t xml:space="preserve"> or prolongation of existing</w:t>
-            </w:r>
-            <w:r>
-              <w:rPr>
-                <w:rFonts w:ascii="Times New Roman" w:hAnsi="Times New Roman" w:cs="Times New Roman"/>
-                <w:sz w:val="16"/>
-                <w:szCs w:val="16"/>
-              </w:rPr>
-              <w:t xml:space="preserve"> </w:t>
-            </w:r>
-            <w:proofErr w:type="spellStart"/>
-            <w:r>
-              <w:rPr>
-                <w:rFonts w:ascii="Times New Roman" w:hAnsi="Times New Roman" w:cs="Times New Roman"/>
-                <w:sz w:val="16"/>
-                <w:szCs w:val="16"/>
-              </w:rPr>
-              <w:t>hospitalisation</w:t>
-            </w:r>
-            <w:proofErr w:type="spellEnd"/>
           </w:p>
           <w:p>
             <w:pPr>
@@ -8369,25 +8315,7 @@
                 <w:sz w:val="16"/>
                 <w:szCs w:val="16"/>
               </w:rPr>
-              <w:t>? (</w:t>
-            </w:r>
-            <w:proofErr w:type="gramStart"/>
-            <w:r>
-              <w:rPr>
-                <w:rFonts w:ascii="Times New Roman" w:hAnsi="Times New Roman" w:cs="Times New Roman"/>
-                <w:sz w:val="16"/>
-                <w:szCs w:val="16"/>
-              </w:rPr>
-              <w:t>complete</w:t>
-            </w:r>
-            <w:proofErr w:type="gramEnd"/>
-            <w:r>
-              <w:rPr>
-                <w:rFonts w:ascii="Times New Roman" w:hAnsi="Times New Roman" w:cs="Times New Roman"/>
-                <w:sz w:val="16"/>
-                <w:szCs w:val="16"/>
-              </w:rPr>
-              <w:t xml:space="preserve"> only if section 5. is ticked Yes)</w:t>
+              <w:t>? (complete only if section 5. is ticked Yes)</w:t>
             </w:r>
           </w:p>
           <w:p>
@@ -13830,10 +13758,6 @@
 </file>
 
 <file path=customXml/item1.xml><?xml version="1.0" encoding="utf-8"?>
-<b:Sources xmlns:b="http://schemas.openxmlformats.org/officeDocument/2006/bibliography" xmlns="http://schemas.openxmlformats.org/officeDocument/2006/bibliography" SelectedStyle="\APA.XSL" StyleName="APA"/>
-</file>
-
-<file path=customXml/item2.xml><?xml version="1.0" encoding="utf-8"?>
 <p:properties xmlns:p="http://schemas.microsoft.com/office/2006/metadata/properties" xmlns:xsi="http://www.w3.org/2001/XMLSchema-instance">
   <documentManagement>
     <lcf76f155ced4ddcb4097134ff3c332f xmlns="a96d7c79-e417-43c8-b247-a9bea165cf53">
@@ -13844,16 +13768,11 @@
 </p:properties>
 </file>
 
-<file path=customXml/item3.xml><?xml version="1.0" encoding="utf-8"?>
-<?mso-contentType ?>
-<FormTemplates xmlns="http://schemas.microsoft.com/sharepoint/v3/contenttype/forms">
-  <Display>DocumentLibraryForm</Display>
-  <Edit>DocumentLibraryForm</Edit>
-  <New>DocumentLibraryForm</New>
-</FormTemplates>
+<file path=customXml/item2.xml><?xml version="1.0" encoding="utf-8"?>
+<b:Sources xmlns:b="http://schemas.openxmlformats.org/officeDocument/2006/bibliography" xmlns="http://schemas.openxmlformats.org/officeDocument/2006/bibliography" SelectedStyle="\APA.XSL" StyleName="APA"/>
 </file>
 
-<file path=customXml/item4.xml><?xml version="1.0" encoding="utf-8"?>
+<file path=customXml/item3.xml><?xml version="1.0" encoding="utf-8"?>
 <ct:contentTypeSchema xmlns:ct="http://schemas.microsoft.com/office/2006/metadata/contentType" xmlns:ma="http://schemas.microsoft.com/office/2006/metadata/properties/metaAttributes" ct:_="" ma:_="" ma:contentTypeName="Document" ma:contentTypeID="0x010100A21F4A21D4678D499B82472BD06746BF" ma:contentTypeVersion="13" ma:contentTypeDescription="Create a new document." ma:contentTypeScope="" ma:versionID="f3c8b4d22ec823cc76163c46de3df5c8">
   <xsd:schema xmlns:xsd="http://www.w3.org/2001/XMLSchema" xmlns:xs="http://www.w3.org/2001/XMLSchema" xmlns:p="http://schemas.microsoft.com/office/2006/metadata/properties" xmlns:ns2="a96d7c79-e417-43c8-b247-a9bea165cf53" xmlns:ns3="5a62f564-6c95-44c7-9852-f816516ef194" targetNamespace="http://schemas.microsoft.com/office/2006/metadata/properties" ma:root="true" ma:fieldsID="f534863a24fac4f8203974ffe0da04ca" ns2:_="" ns3:_="">
     <xsd:import namespace="a96d7c79-e417-43c8-b247-a9bea165cf53"/>
@@ -14076,15 +13995,16 @@
 </ct:contentTypeSchema>
 </file>
 
-<file path=customXml/itemProps1.xml><?xml version="1.0" encoding="utf-8"?>
-<ds:datastoreItem xmlns:ds="http://schemas.openxmlformats.org/officeDocument/2006/customXml" ds:itemID="{E6B46028-D2F7-4AF4-9E70-087825343A45}">
-  <ds:schemaRefs>
-    <ds:schemaRef ds:uri="http://schemas.openxmlformats.org/officeDocument/2006/bibliography"/>
-  </ds:schemaRefs>
-</ds:datastoreItem>
+<file path=customXml/item4.xml><?xml version="1.0" encoding="utf-8"?>
+<?mso-contentType ?>
+<FormTemplates xmlns="http://schemas.microsoft.com/sharepoint/v3/contenttype/forms">
+  <Display>DocumentLibraryForm</Display>
+  <Edit>DocumentLibraryForm</Edit>
+  <New>DocumentLibraryForm</New>
+</FormTemplates>
 </file>
 
-<file path=customXml/itemProps2.xml><?xml version="1.0" encoding="utf-8"?>
+<file path=customXml/itemProps1.xml><?xml version="1.0" encoding="utf-8"?>
 <ds:datastoreItem xmlns:ds="http://schemas.openxmlformats.org/officeDocument/2006/customXml" ds:itemID="{E77F544A-CE7D-4D6F-8580-BD72B3D3E929}">
   <ds:schemaRefs>
     <ds:schemaRef ds:uri="http://schemas.microsoft.com/office/2006/metadata/properties"/>
@@ -14095,15 +14015,15 @@
 </ds:datastoreItem>
 </file>
 
-<file path=customXml/itemProps3.xml><?xml version="1.0" encoding="utf-8"?>
-<ds:datastoreItem xmlns:ds="http://schemas.openxmlformats.org/officeDocument/2006/customXml" ds:itemID="{E9307DF0-3AC8-4F54-B40D-28CE5F7A0EB6}">
+<file path=customXml/itemProps2.xml><?xml version="1.0" encoding="utf-8"?>
+<ds:datastoreItem xmlns:ds="http://schemas.openxmlformats.org/officeDocument/2006/customXml" ds:itemID="{E6B46028-D2F7-4AF4-9E70-087825343A45}">
   <ds:schemaRefs>
-    <ds:schemaRef ds:uri="http://schemas.microsoft.com/sharepoint/v3/contenttype/forms"/>
+    <ds:schemaRef ds:uri="http://schemas.openxmlformats.org/officeDocument/2006/bibliography"/>
   </ds:schemaRefs>
 </ds:datastoreItem>
 </file>
 
-<file path=customXml/itemProps4.xml><?xml version="1.0" encoding="utf-8"?>
+<file path=customXml/itemProps3.xml><?xml version="1.0" encoding="utf-8"?>
 <ds:datastoreItem xmlns:ds="http://schemas.openxmlformats.org/officeDocument/2006/customXml" ds:itemID="{F581A552-6BA8-4F0D-824D-C94E04369C43}">
   <ds:schemaRefs>
     <ds:schemaRef ds:uri="http://schemas.microsoft.com/office/2006/metadata/contentType"/>
@@ -14120,4 +14040,12 @@
     <ds:schemaRef ds:uri="http://schemas.microsoft.com/internal/obd"/>
   </ds:schemaRefs>
 </ds:datastoreItem>
+</file>
+
+<file path=customXml/itemProps4.xml><?xml version="1.0" encoding="utf-8"?>
+<ds:datastoreItem xmlns:ds="http://schemas.openxmlformats.org/officeDocument/2006/customXml" ds:itemID="{E9307DF0-3AC8-4F54-B40D-28CE5F7A0EB6}">
+  <ds:schemaRefs>
+    <ds:schemaRef ds:uri="http://schemas.microsoft.com/sharepoint/v3/contenttype/forms"/>
+  </ds:schemaRefs>
+</ds:datastoreItem>
 </file>
</xml_diff>

<commit_message>
chore: modificaciones en el form de EA
</commit_message>
<xml_diff>
--- a/plantilla/Adverse Events.docx
+++ b/plantilla/Adverse Events.docx
@@ -1,6 +1,6 @@
 
 <file path=word/document.xml><?xml version="1.0" encoding="utf-8"?>
-<w:document xmlns:wpc="http://schemas.microsoft.com/office/word/2010/wordprocessingCanvas" xmlns:cx="http://schemas.microsoft.com/office/drawing/2014/chartex" xmlns:cx1="http://schemas.microsoft.com/office/drawing/2015/9/8/chartex" xmlns:cx2="http://schemas.microsoft.com/office/drawing/2015/10/21/chartex" xmlns:cx3="http://schemas.microsoft.com/office/drawing/2016/5/9/chartex" xmlns:cx4="http://schemas.microsoft.com/office/drawing/2016/5/10/chartex" xmlns:cx5="http://schemas.microsoft.com/office/drawing/2016/5/11/chartex" xmlns:cx6="http://schemas.microsoft.com/office/drawing/2016/5/12/chartex" xmlns:cx7="http://schemas.microsoft.com/office/drawing/2016/5/13/chartex" xmlns:cx8="http://schemas.microsoft.com/office/drawing/2016/5/14/chartex" xmlns:mc="http://schemas.openxmlformats.org/markup-compatibility/2006" xmlns:aink="http://schemas.microsoft.com/office/drawing/2016/ink" xmlns:am3d="http://schemas.microsoft.com/office/drawing/2017/model3d" xmlns:o="urn:schemas-microsoft-com:office:office" xmlns:oel="http://schemas.microsoft.com/office/2019/extlst" xmlns:r="http://schemas.openxmlformats.org/officeDocument/2006/relationships" xmlns:m="http://schemas.openxmlformats.org/officeDocument/2006/math" xmlns:v="urn:schemas-microsoft-com:vml" xmlns:wp14="http://schemas.microsoft.com/office/word/2010/wordprocessingDrawing" xmlns:wp="http://schemas.openxmlformats.org/drawingml/2006/wordprocessingDrawing" xmlns:w10="urn:schemas-microsoft-com:office:word" xmlns:w="http://schemas.openxmlformats.org/wordprocessingml/2006/main" xmlns:w14="http://schemas.microsoft.com/office/word/2010/wordml" xmlns:w15="http://schemas.microsoft.com/office/word/2012/wordml" xmlns:w16cex="http://schemas.microsoft.com/office/word/2018/wordml/cex" xmlns:w16cid="http://schemas.microsoft.com/office/word/2016/wordml/cid" xmlns:w16="http://schemas.microsoft.com/office/word/2018/wordml" xmlns:w16du="http://schemas.microsoft.com/office/word/2023/wordml/word16du" xmlns:w16sdtdh="http://schemas.microsoft.com/office/word/2020/wordml/sdtdatahash" xmlns:w16se="http://schemas.microsoft.com/office/word/2015/wordml/symex" xmlns:wpg="http://schemas.microsoft.com/office/word/2010/wordprocessingGroup" xmlns:wpi="http://schemas.microsoft.com/office/word/2010/wordprocessingInk" xmlns:wne="http://schemas.microsoft.com/office/word/2006/wordml" xmlns:wps="http://schemas.microsoft.com/office/word/2010/wordprocessingShape" mc:Ignorable="w14 w15 w16se w16cid w16 w16cex w16sdtdh w16du wp14">
+<w:document xmlns:wpc="http://schemas.microsoft.com/office/word/2010/wordprocessingCanvas" xmlns:cx="http://schemas.microsoft.com/office/drawing/2014/chartex" xmlns:cx1="http://schemas.microsoft.com/office/drawing/2015/9/8/chartex" xmlns:cx2="http://schemas.microsoft.com/office/drawing/2015/10/21/chartex" xmlns:cx3="http://schemas.microsoft.com/office/drawing/2016/5/9/chartex" xmlns:cx4="http://schemas.microsoft.com/office/drawing/2016/5/10/chartex" xmlns:cx5="http://schemas.microsoft.com/office/drawing/2016/5/11/chartex" xmlns:cx6="http://schemas.microsoft.com/office/drawing/2016/5/12/chartex" xmlns:cx7="http://schemas.microsoft.com/office/drawing/2016/5/13/chartex" xmlns:cx8="http://schemas.microsoft.com/office/drawing/2016/5/14/chartex" xmlns:mc="http://schemas.openxmlformats.org/markup-compatibility/2006" xmlns:aink="http://schemas.microsoft.com/office/drawing/2016/ink" xmlns:am3d="http://schemas.microsoft.com/office/drawing/2017/model3d" xmlns:o="urn:schemas-microsoft-com:office:office" xmlns:oel="http://schemas.microsoft.com/office/2019/extlst" xmlns:r="http://schemas.openxmlformats.org/officeDocument/2006/relationships" xmlns:m="http://schemas.openxmlformats.org/officeDocument/2006/math" xmlns:v="urn:schemas-microsoft-com:vml" xmlns:wp14="http://schemas.microsoft.com/office/word/2010/wordprocessingDrawing" xmlns:wp="http://schemas.openxmlformats.org/drawingml/2006/wordprocessingDrawing" xmlns:w10="urn:schemas-microsoft-com:office:word" xmlns:w="http://schemas.openxmlformats.org/wordprocessingml/2006/main" xmlns:w14="http://schemas.microsoft.com/office/word/2010/wordml" xmlns:w15="http://schemas.microsoft.com/office/word/2012/wordml" xmlns:w16cex="http://schemas.microsoft.com/office/word/2018/wordml/cex" xmlns:w16cid="http://schemas.microsoft.com/office/word/2016/wordml/cid" xmlns:w16="http://schemas.microsoft.com/office/word/2018/wordml" xmlns:w16du="http://schemas.microsoft.com/office/word/2023/wordml/word16du" xmlns:w16sdtdh="http://schemas.microsoft.com/office/word/2020/wordml/sdtdatahash" xmlns:w16sdtfl="http://schemas.microsoft.com/office/word/2024/wordml/sdtformatlock" xmlns:w16se="http://schemas.microsoft.com/office/word/2015/wordml/symex" xmlns:wpg="http://schemas.microsoft.com/office/word/2010/wordprocessingGroup" xmlns:wpi="http://schemas.microsoft.com/office/word/2010/wordprocessingInk" xmlns:wne="http://schemas.microsoft.com/office/word/2006/wordml" xmlns:wps="http://schemas.microsoft.com/office/word/2010/wordprocessingShape" mc:Ignorable="w14 w15 w16se w16cid w16 w16cex w16sdtdh w16sdtfl w16du wp14">
   <w:body>
     <w:tbl>
       <w:tblPr>
@@ -27,7 +27,6 @@
             <w:tcBorders>
               <w:bottom w:val="single" w:sz="4" w:space="0" w:color="auto"/>
             </w:tcBorders>
-            <w:shd w:val="clear" w:color="auto" w:fill="auto"/>
           </w:tcPr>
           <w:p>
             <w:pPr>
@@ -67,7 +66,6 @@
             <w:tcBorders>
               <w:bottom w:val="single" w:sz="4" w:space="0" w:color="auto"/>
             </w:tcBorders>
-            <w:shd w:val="clear" w:color="auto" w:fill="auto"/>
           </w:tcPr>
           <w:p>
             <w:pPr>
@@ -98,7 +96,6 @@
             <w:tcBorders>
               <w:bottom w:val="single" w:sz="4" w:space="0" w:color="auto"/>
             </w:tcBorders>
-            <w:shd w:val="clear" w:color="auto" w:fill="auto"/>
           </w:tcPr>
           <w:p>
             <w:pPr>
@@ -136,7 +133,6 @@
             <w:tcBorders>
               <w:bottom w:val="single" w:sz="4" w:space="0" w:color="auto"/>
             </w:tcBorders>
-            <w:shd w:val="clear" w:color="auto" w:fill="auto"/>
           </w:tcPr>
           <w:p>
             <w:pPr>
@@ -414,7 +410,6 @@
               <w:bottom w:val="single" w:sz="4" w:space="0" w:color="auto"/>
               <w:right w:val="single" w:sz="4" w:space="0" w:color="auto"/>
             </w:tcBorders>
-            <w:shd w:val="clear" w:color="auto" w:fill="auto"/>
           </w:tcPr>
           <w:p>
             <w:pPr>
@@ -569,7 +564,63 @@
                 <w:szCs w:val="16"/>
                 <w:lang w:val="en-GB"/>
               </w:rPr>
-              <w:t xml:space="preserve">} </w:t>
+              <w:t>}</w:t>
+            </w:r>
+            <w:r>
+              <w:rPr>
+                <w:sz w:val="16"/>
+                <w:szCs w:val="16"/>
+                <w:lang w:val="en-GB"/>
+              </w:rPr>
+              <w:t xml:space="preserve"> </w:t>
+            </w:r>
+            <w:r>
+              <w:rPr>
+                <w:sz w:val="16"/>
+                <w:szCs w:val="16"/>
+                <w:lang w:val="en-GB"/>
+              </w:rPr>
+              <w:t>Medical Survey</w:t>
+            </w:r>
+            <w:r>
+              <w:rPr>
+                <w:sz w:val="16"/>
+                <w:szCs w:val="16"/>
+                <w:lang w:val="en-GB"/>
+              </w:rPr>
+              <w:t xml:space="preserve"> </w:t>
+            </w:r>
+            <w:r>
+              <w:rPr>
+                <w:sz w:val="16"/>
+                <w:szCs w:val="16"/>
+                <w:lang w:val="en-GB"/>
+              </w:rPr>
+              <w:t xml:space="preserve">${valor5} </w:t>
+            </w:r>
+            <w:r>
+              <w:rPr>
+                <w:sz w:val="16"/>
+                <w:szCs w:val="16"/>
+                <w:lang w:val="en-GB"/>
+              </w:rPr>
+              <w:t>Delphi Study</w:t>
+            </w:r>
+            <w:r>
+              <w:rPr>
+                <w:sz w:val="16"/>
+                <w:szCs w:val="16"/>
+                <w:lang w:val="en-GB"/>
+              </w:rPr>
+              <w:t xml:space="preserve"> </w:t>
+            </w:r>
+            <w:r>
+              <w:rPr>
+                <w:sz w:val="16"/>
+                <w:szCs w:val="16"/>
+                <w:lang w:val="en-GB"/>
+              </w:rPr>
+              <w:t xml:space="preserve"> ${valor6}</w:t>
             </w:r>
             <w:r>
               <w:rPr>
@@ -5230,41 +5281,6 @@
                 <w:szCs w:val="16"/>
               </w:rPr>
               <w:t>NO</w:t>
-            </w:r>
-            <w:r>
-              <w:rPr>
-                <w:sz w:val="16"/>
-                <w:szCs w:val="16"/>
-              </w:rPr>
-              <w:tab/>
-            </w:r>
-            <w:r>
-              <w:rPr>
-                <w:sz w:val="16"/>
-                <w:szCs w:val="16"/>
-              </w:rPr>
-              <w:t>${</w:t>
-            </w:r>
-            <w:r>
-              <w:rPr>
-                <w:sz w:val="16"/>
-                <w:szCs w:val="16"/>
-              </w:rPr>
-              <w:t>RE_CAUSALITY</w:t>
-            </w:r>
-            <w:r>
-              <w:rPr>
-                <w:sz w:val="16"/>
-                <w:szCs w:val="16"/>
-              </w:rPr>
-              <w:t xml:space="preserve">3} </w:t>
-            </w:r>
-            <w:r>
-              <w:rPr>
-                <w:sz w:val="16"/>
-                <w:szCs w:val="16"/>
-              </w:rPr>
-              <w:t>Unknown</w:t>
             </w:r>
           </w:p>
         </w:tc>
@@ -8971,7 +8987,7 @@
 </file>
 
 <file path=word/endnotes.xml><?xml version="1.0" encoding="utf-8"?>
-<w:endnotes xmlns:wpc="http://schemas.microsoft.com/office/word/2010/wordprocessingCanvas" xmlns:cx="http://schemas.microsoft.com/office/drawing/2014/chartex" xmlns:cx1="http://schemas.microsoft.com/office/drawing/2015/9/8/chartex" xmlns:cx2="http://schemas.microsoft.com/office/drawing/2015/10/21/chartex" xmlns:cx3="http://schemas.microsoft.com/office/drawing/2016/5/9/chartex" xmlns:cx4="http://schemas.microsoft.com/office/drawing/2016/5/10/chartex" xmlns:cx5="http://schemas.microsoft.com/office/drawing/2016/5/11/chartex" xmlns:cx6="http://schemas.microsoft.com/office/drawing/2016/5/12/chartex" xmlns:cx7="http://schemas.microsoft.com/office/drawing/2016/5/13/chartex" xmlns:cx8="http://schemas.microsoft.com/office/drawing/2016/5/14/chartex" xmlns:mc="http://schemas.openxmlformats.org/markup-compatibility/2006" xmlns:aink="http://schemas.microsoft.com/office/drawing/2016/ink" xmlns:am3d="http://schemas.microsoft.com/office/drawing/2017/model3d" xmlns:o="urn:schemas-microsoft-com:office:office" xmlns:oel="http://schemas.microsoft.com/office/2019/extlst" xmlns:r="http://schemas.openxmlformats.org/officeDocument/2006/relationships" xmlns:m="http://schemas.openxmlformats.org/officeDocument/2006/math" xmlns:v="urn:schemas-microsoft-com:vml" xmlns:wp14="http://schemas.microsoft.com/office/word/2010/wordprocessingDrawing" xmlns:wp="http://schemas.openxmlformats.org/drawingml/2006/wordprocessingDrawing" xmlns:w10="urn:schemas-microsoft-com:office:word" xmlns:w="http://schemas.openxmlformats.org/wordprocessingml/2006/main" xmlns:w14="http://schemas.microsoft.com/office/word/2010/wordml" xmlns:w15="http://schemas.microsoft.com/office/word/2012/wordml" xmlns:w16cex="http://schemas.microsoft.com/office/word/2018/wordml/cex" xmlns:w16cid="http://schemas.microsoft.com/office/word/2016/wordml/cid" xmlns:w16="http://schemas.microsoft.com/office/word/2018/wordml" xmlns:w16du="http://schemas.microsoft.com/office/word/2023/wordml/word16du" xmlns:w16sdtdh="http://schemas.microsoft.com/office/word/2020/wordml/sdtdatahash" xmlns:w16se="http://schemas.microsoft.com/office/word/2015/wordml/symex" xmlns:wpg="http://schemas.microsoft.com/office/word/2010/wordprocessingGroup" xmlns:wpi="http://schemas.microsoft.com/office/word/2010/wordprocessingInk" xmlns:wne="http://schemas.microsoft.com/office/word/2006/wordml" xmlns:wps="http://schemas.microsoft.com/office/word/2010/wordprocessingShape" mc:Ignorable="w14 w15 w16se w16cid w16 w16cex w16sdtdh w16du wp14">
+<w:endnotes xmlns:wpc="http://schemas.microsoft.com/office/word/2010/wordprocessingCanvas" xmlns:cx="http://schemas.microsoft.com/office/drawing/2014/chartex" xmlns:cx1="http://schemas.microsoft.com/office/drawing/2015/9/8/chartex" xmlns:cx2="http://schemas.microsoft.com/office/drawing/2015/10/21/chartex" xmlns:cx3="http://schemas.microsoft.com/office/drawing/2016/5/9/chartex" xmlns:cx4="http://schemas.microsoft.com/office/drawing/2016/5/10/chartex" xmlns:cx5="http://schemas.microsoft.com/office/drawing/2016/5/11/chartex" xmlns:cx6="http://schemas.microsoft.com/office/drawing/2016/5/12/chartex" xmlns:cx7="http://schemas.microsoft.com/office/drawing/2016/5/13/chartex" xmlns:cx8="http://schemas.microsoft.com/office/drawing/2016/5/14/chartex" xmlns:mc="http://schemas.openxmlformats.org/markup-compatibility/2006" xmlns:aink="http://schemas.microsoft.com/office/drawing/2016/ink" xmlns:am3d="http://schemas.microsoft.com/office/drawing/2017/model3d" xmlns:o="urn:schemas-microsoft-com:office:office" xmlns:oel="http://schemas.microsoft.com/office/2019/extlst" xmlns:r="http://schemas.openxmlformats.org/officeDocument/2006/relationships" xmlns:m="http://schemas.openxmlformats.org/officeDocument/2006/math" xmlns:v="urn:schemas-microsoft-com:vml" xmlns:wp14="http://schemas.microsoft.com/office/word/2010/wordprocessingDrawing" xmlns:wp="http://schemas.openxmlformats.org/drawingml/2006/wordprocessingDrawing" xmlns:w10="urn:schemas-microsoft-com:office:word" xmlns:w="http://schemas.openxmlformats.org/wordprocessingml/2006/main" xmlns:w14="http://schemas.microsoft.com/office/word/2010/wordml" xmlns:w15="http://schemas.microsoft.com/office/word/2012/wordml" xmlns:w16cex="http://schemas.microsoft.com/office/word/2018/wordml/cex" xmlns:w16cid="http://schemas.microsoft.com/office/word/2016/wordml/cid" xmlns:w16="http://schemas.microsoft.com/office/word/2018/wordml" xmlns:w16du="http://schemas.microsoft.com/office/word/2023/wordml/word16du" xmlns:w16sdtdh="http://schemas.microsoft.com/office/word/2020/wordml/sdtdatahash" xmlns:w16sdtfl="http://schemas.microsoft.com/office/word/2024/wordml/sdtformatlock" xmlns:w16se="http://schemas.microsoft.com/office/word/2015/wordml/symex" xmlns:wpg="http://schemas.microsoft.com/office/word/2010/wordprocessingGroup" xmlns:wpi="http://schemas.microsoft.com/office/word/2010/wordprocessingInk" xmlns:wne="http://schemas.microsoft.com/office/word/2006/wordml" xmlns:wps="http://schemas.microsoft.com/office/word/2010/wordprocessingShape" mc:Ignorable="w14 w15 w16se w16cid w16 w16cex w16sdtdh w16sdtfl w16du wp14">
   <w:endnote w:type="separator" w:id="-1">
     <w:p>
       <w:r>
@@ -8990,7 +9006,7 @@
 </file>
 
 <file path=word/footer1.xml><?xml version="1.0" encoding="utf-8"?>
-<w:ftr xmlns:wpc="http://schemas.microsoft.com/office/word/2010/wordprocessingCanvas" xmlns:cx="http://schemas.microsoft.com/office/drawing/2014/chartex" xmlns:cx1="http://schemas.microsoft.com/office/drawing/2015/9/8/chartex" xmlns:cx2="http://schemas.microsoft.com/office/drawing/2015/10/21/chartex" xmlns:cx3="http://schemas.microsoft.com/office/drawing/2016/5/9/chartex" xmlns:cx4="http://schemas.microsoft.com/office/drawing/2016/5/10/chartex" xmlns:cx5="http://schemas.microsoft.com/office/drawing/2016/5/11/chartex" xmlns:cx6="http://schemas.microsoft.com/office/drawing/2016/5/12/chartex" xmlns:cx7="http://schemas.microsoft.com/office/drawing/2016/5/13/chartex" xmlns:cx8="http://schemas.microsoft.com/office/drawing/2016/5/14/chartex" xmlns:mc="http://schemas.openxmlformats.org/markup-compatibility/2006" xmlns:aink="http://schemas.microsoft.com/office/drawing/2016/ink" xmlns:am3d="http://schemas.microsoft.com/office/drawing/2017/model3d" xmlns:o="urn:schemas-microsoft-com:office:office" xmlns:oel="http://schemas.microsoft.com/office/2019/extlst" xmlns:r="http://schemas.openxmlformats.org/officeDocument/2006/relationships" xmlns:m="http://schemas.openxmlformats.org/officeDocument/2006/math" xmlns:v="urn:schemas-microsoft-com:vml" xmlns:wp14="http://schemas.microsoft.com/office/word/2010/wordprocessingDrawing" xmlns:wp="http://schemas.openxmlformats.org/drawingml/2006/wordprocessingDrawing" xmlns:w10="urn:schemas-microsoft-com:office:word" xmlns:w="http://schemas.openxmlformats.org/wordprocessingml/2006/main" xmlns:w14="http://schemas.microsoft.com/office/word/2010/wordml" xmlns:w15="http://schemas.microsoft.com/office/word/2012/wordml" xmlns:w16cex="http://schemas.microsoft.com/office/word/2018/wordml/cex" xmlns:w16cid="http://schemas.microsoft.com/office/word/2016/wordml/cid" xmlns:w16="http://schemas.microsoft.com/office/word/2018/wordml" xmlns:w16du="http://schemas.microsoft.com/office/word/2023/wordml/word16du" xmlns:w16sdtdh="http://schemas.microsoft.com/office/word/2020/wordml/sdtdatahash" xmlns:w16se="http://schemas.microsoft.com/office/word/2015/wordml/symex" xmlns:wpg="http://schemas.microsoft.com/office/word/2010/wordprocessingGroup" xmlns:wpi="http://schemas.microsoft.com/office/word/2010/wordprocessingInk" xmlns:wne="http://schemas.microsoft.com/office/word/2006/wordml" xmlns:wps="http://schemas.microsoft.com/office/word/2010/wordprocessingShape" mc:Ignorable="w14 w15 w16se w16cid w16 w16cex w16sdtdh w16du wp14">
+<w:ftr xmlns:wpc="http://schemas.microsoft.com/office/word/2010/wordprocessingCanvas" xmlns:cx="http://schemas.microsoft.com/office/drawing/2014/chartex" xmlns:cx1="http://schemas.microsoft.com/office/drawing/2015/9/8/chartex" xmlns:cx2="http://schemas.microsoft.com/office/drawing/2015/10/21/chartex" xmlns:cx3="http://schemas.microsoft.com/office/drawing/2016/5/9/chartex" xmlns:cx4="http://schemas.microsoft.com/office/drawing/2016/5/10/chartex" xmlns:cx5="http://schemas.microsoft.com/office/drawing/2016/5/11/chartex" xmlns:cx6="http://schemas.microsoft.com/office/drawing/2016/5/12/chartex" xmlns:cx7="http://schemas.microsoft.com/office/drawing/2016/5/13/chartex" xmlns:cx8="http://schemas.microsoft.com/office/drawing/2016/5/14/chartex" xmlns:mc="http://schemas.openxmlformats.org/markup-compatibility/2006" xmlns:aink="http://schemas.microsoft.com/office/drawing/2016/ink" xmlns:am3d="http://schemas.microsoft.com/office/drawing/2017/model3d" xmlns:o="urn:schemas-microsoft-com:office:office" xmlns:oel="http://schemas.microsoft.com/office/2019/extlst" xmlns:r="http://schemas.openxmlformats.org/officeDocument/2006/relationships" xmlns:m="http://schemas.openxmlformats.org/officeDocument/2006/math" xmlns:v="urn:schemas-microsoft-com:vml" xmlns:wp14="http://schemas.microsoft.com/office/word/2010/wordprocessingDrawing" xmlns:wp="http://schemas.openxmlformats.org/drawingml/2006/wordprocessingDrawing" xmlns:w10="urn:schemas-microsoft-com:office:word" xmlns:w="http://schemas.openxmlformats.org/wordprocessingml/2006/main" xmlns:w14="http://schemas.microsoft.com/office/word/2010/wordml" xmlns:w15="http://schemas.microsoft.com/office/word/2012/wordml" xmlns:w16cex="http://schemas.microsoft.com/office/word/2018/wordml/cex" xmlns:w16cid="http://schemas.microsoft.com/office/word/2016/wordml/cid" xmlns:w16="http://schemas.microsoft.com/office/word/2018/wordml" xmlns:w16du="http://schemas.microsoft.com/office/word/2023/wordml/word16du" xmlns:w16sdtdh="http://schemas.microsoft.com/office/word/2020/wordml/sdtdatahash" xmlns:w16sdtfl="http://schemas.microsoft.com/office/word/2024/wordml/sdtformatlock" xmlns:w16se="http://schemas.microsoft.com/office/word/2015/wordml/symex" xmlns:wpg="http://schemas.microsoft.com/office/word/2010/wordprocessingGroup" xmlns:wpi="http://schemas.microsoft.com/office/word/2010/wordprocessingInk" xmlns:wne="http://schemas.microsoft.com/office/word/2006/wordml" xmlns:wps="http://schemas.microsoft.com/office/word/2010/wordprocessingShape" mc:Ignorable="w14 w15 w16se w16cid w16 w16cex w16sdtdh w16sdtfl w16du wp14">
   <w:p>
     <w:pPr>
       <w:pStyle w:val="Piedepgina"/>
@@ -9017,7 +9033,7 @@
 </file>
 
 <file path=word/footer2.xml><?xml version="1.0" encoding="utf-8"?>
-<w:ftr xmlns:wpc="http://schemas.microsoft.com/office/word/2010/wordprocessingCanvas" xmlns:cx="http://schemas.microsoft.com/office/drawing/2014/chartex" xmlns:cx1="http://schemas.microsoft.com/office/drawing/2015/9/8/chartex" xmlns:cx2="http://schemas.microsoft.com/office/drawing/2015/10/21/chartex" xmlns:cx3="http://schemas.microsoft.com/office/drawing/2016/5/9/chartex" xmlns:cx4="http://schemas.microsoft.com/office/drawing/2016/5/10/chartex" xmlns:cx5="http://schemas.microsoft.com/office/drawing/2016/5/11/chartex" xmlns:cx6="http://schemas.microsoft.com/office/drawing/2016/5/12/chartex" xmlns:cx7="http://schemas.microsoft.com/office/drawing/2016/5/13/chartex" xmlns:cx8="http://schemas.microsoft.com/office/drawing/2016/5/14/chartex" xmlns:mc="http://schemas.openxmlformats.org/markup-compatibility/2006" xmlns:aink="http://schemas.microsoft.com/office/drawing/2016/ink" xmlns:am3d="http://schemas.microsoft.com/office/drawing/2017/model3d" xmlns:o="urn:schemas-microsoft-com:office:office" xmlns:oel="http://schemas.microsoft.com/office/2019/extlst" xmlns:r="http://schemas.openxmlformats.org/officeDocument/2006/relationships" xmlns:m="http://schemas.openxmlformats.org/officeDocument/2006/math" xmlns:v="urn:schemas-microsoft-com:vml" xmlns:wp14="http://schemas.microsoft.com/office/word/2010/wordprocessingDrawing" xmlns:wp="http://schemas.openxmlformats.org/drawingml/2006/wordprocessingDrawing" xmlns:w10="urn:schemas-microsoft-com:office:word" xmlns:w="http://schemas.openxmlformats.org/wordprocessingml/2006/main" xmlns:w14="http://schemas.microsoft.com/office/word/2010/wordml" xmlns:w15="http://schemas.microsoft.com/office/word/2012/wordml" xmlns:w16cex="http://schemas.microsoft.com/office/word/2018/wordml/cex" xmlns:w16cid="http://schemas.microsoft.com/office/word/2016/wordml/cid" xmlns:w16="http://schemas.microsoft.com/office/word/2018/wordml" xmlns:w16du="http://schemas.microsoft.com/office/word/2023/wordml/word16du" xmlns:w16sdtdh="http://schemas.microsoft.com/office/word/2020/wordml/sdtdatahash" xmlns:w16se="http://schemas.microsoft.com/office/word/2015/wordml/symex" xmlns:wpg="http://schemas.microsoft.com/office/word/2010/wordprocessingGroup" xmlns:wpi="http://schemas.microsoft.com/office/word/2010/wordprocessingInk" xmlns:wne="http://schemas.microsoft.com/office/word/2006/wordml" xmlns:wps="http://schemas.microsoft.com/office/word/2010/wordprocessingShape" mc:Ignorable="w14 w15 w16se w16cid w16 w16cex w16sdtdh w16du wp14">
+<w:ftr xmlns:wpc="http://schemas.microsoft.com/office/word/2010/wordprocessingCanvas" xmlns:cx="http://schemas.microsoft.com/office/drawing/2014/chartex" xmlns:cx1="http://schemas.microsoft.com/office/drawing/2015/9/8/chartex" xmlns:cx2="http://schemas.microsoft.com/office/drawing/2015/10/21/chartex" xmlns:cx3="http://schemas.microsoft.com/office/drawing/2016/5/9/chartex" xmlns:cx4="http://schemas.microsoft.com/office/drawing/2016/5/10/chartex" xmlns:cx5="http://schemas.microsoft.com/office/drawing/2016/5/11/chartex" xmlns:cx6="http://schemas.microsoft.com/office/drawing/2016/5/12/chartex" xmlns:cx7="http://schemas.microsoft.com/office/drawing/2016/5/13/chartex" xmlns:cx8="http://schemas.microsoft.com/office/drawing/2016/5/14/chartex" xmlns:mc="http://schemas.openxmlformats.org/markup-compatibility/2006" xmlns:aink="http://schemas.microsoft.com/office/drawing/2016/ink" xmlns:am3d="http://schemas.microsoft.com/office/drawing/2017/model3d" xmlns:o="urn:schemas-microsoft-com:office:office" xmlns:oel="http://schemas.microsoft.com/office/2019/extlst" xmlns:r="http://schemas.openxmlformats.org/officeDocument/2006/relationships" xmlns:m="http://schemas.openxmlformats.org/officeDocument/2006/math" xmlns:v="urn:schemas-microsoft-com:vml" xmlns:wp14="http://schemas.microsoft.com/office/word/2010/wordprocessingDrawing" xmlns:wp="http://schemas.openxmlformats.org/drawingml/2006/wordprocessingDrawing" xmlns:w10="urn:schemas-microsoft-com:office:word" xmlns:w="http://schemas.openxmlformats.org/wordprocessingml/2006/main" xmlns:w14="http://schemas.microsoft.com/office/word/2010/wordml" xmlns:w15="http://schemas.microsoft.com/office/word/2012/wordml" xmlns:w16cex="http://schemas.microsoft.com/office/word/2018/wordml/cex" xmlns:w16cid="http://schemas.microsoft.com/office/word/2016/wordml/cid" xmlns:w16="http://schemas.microsoft.com/office/word/2018/wordml" xmlns:w16du="http://schemas.microsoft.com/office/word/2023/wordml/word16du" xmlns:w16sdtdh="http://schemas.microsoft.com/office/word/2020/wordml/sdtdatahash" xmlns:w16sdtfl="http://schemas.microsoft.com/office/word/2024/wordml/sdtformatlock" xmlns:w16se="http://schemas.microsoft.com/office/word/2015/wordml/symex" xmlns:wpg="http://schemas.microsoft.com/office/word/2010/wordprocessingGroup" xmlns:wpi="http://schemas.microsoft.com/office/word/2010/wordprocessingInk" xmlns:wne="http://schemas.microsoft.com/office/word/2006/wordml" xmlns:wps="http://schemas.microsoft.com/office/word/2010/wordprocessingShape" mc:Ignorable="w14 w15 w16se w16cid w16 w16cex w16sdtdh w16sdtfl w16du wp14">
   <w:p>
     <w:pPr>
       <w:pStyle w:val="Piedepgina"/>
@@ -9108,7 +9124,7 @@
 </file>
 
 <file path=word/footnotes.xml><?xml version="1.0" encoding="utf-8"?>
-<w:footnotes xmlns:wpc="http://schemas.microsoft.com/office/word/2010/wordprocessingCanvas" xmlns:cx="http://schemas.microsoft.com/office/drawing/2014/chartex" xmlns:cx1="http://schemas.microsoft.com/office/drawing/2015/9/8/chartex" xmlns:cx2="http://schemas.microsoft.com/office/drawing/2015/10/21/chartex" xmlns:cx3="http://schemas.microsoft.com/office/drawing/2016/5/9/chartex" xmlns:cx4="http://schemas.microsoft.com/office/drawing/2016/5/10/chartex" xmlns:cx5="http://schemas.microsoft.com/office/drawing/2016/5/11/chartex" xmlns:cx6="http://schemas.microsoft.com/office/drawing/2016/5/12/chartex" xmlns:cx7="http://schemas.microsoft.com/office/drawing/2016/5/13/chartex" xmlns:cx8="http://schemas.microsoft.com/office/drawing/2016/5/14/chartex" xmlns:mc="http://schemas.openxmlformats.org/markup-compatibility/2006" xmlns:aink="http://schemas.microsoft.com/office/drawing/2016/ink" xmlns:am3d="http://schemas.microsoft.com/office/drawing/2017/model3d" xmlns:o="urn:schemas-microsoft-com:office:office" xmlns:oel="http://schemas.microsoft.com/office/2019/extlst" xmlns:r="http://schemas.openxmlformats.org/officeDocument/2006/relationships" xmlns:m="http://schemas.openxmlformats.org/officeDocument/2006/math" xmlns:v="urn:schemas-microsoft-com:vml" xmlns:wp14="http://schemas.microsoft.com/office/word/2010/wordprocessingDrawing" xmlns:wp="http://schemas.openxmlformats.org/drawingml/2006/wordprocessingDrawing" xmlns:w10="urn:schemas-microsoft-com:office:word" xmlns:w="http://schemas.openxmlformats.org/wordprocessingml/2006/main" xmlns:w14="http://schemas.microsoft.com/office/word/2010/wordml" xmlns:w15="http://schemas.microsoft.com/office/word/2012/wordml" xmlns:w16cex="http://schemas.microsoft.com/office/word/2018/wordml/cex" xmlns:w16cid="http://schemas.microsoft.com/office/word/2016/wordml/cid" xmlns:w16="http://schemas.microsoft.com/office/word/2018/wordml" xmlns:w16du="http://schemas.microsoft.com/office/word/2023/wordml/word16du" xmlns:w16sdtdh="http://schemas.microsoft.com/office/word/2020/wordml/sdtdatahash" xmlns:w16se="http://schemas.microsoft.com/office/word/2015/wordml/symex" xmlns:wpg="http://schemas.microsoft.com/office/word/2010/wordprocessingGroup" xmlns:wpi="http://schemas.microsoft.com/office/word/2010/wordprocessingInk" xmlns:wne="http://schemas.microsoft.com/office/word/2006/wordml" xmlns:wps="http://schemas.microsoft.com/office/word/2010/wordprocessingShape" mc:Ignorable="w14 w15 w16se w16cid w16 w16cex w16sdtdh w16du wp14">
+<w:footnotes xmlns:wpc="http://schemas.microsoft.com/office/word/2010/wordprocessingCanvas" xmlns:cx="http://schemas.microsoft.com/office/drawing/2014/chartex" xmlns:cx1="http://schemas.microsoft.com/office/drawing/2015/9/8/chartex" xmlns:cx2="http://schemas.microsoft.com/office/drawing/2015/10/21/chartex" xmlns:cx3="http://schemas.microsoft.com/office/drawing/2016/5/9/chartex" xmlns:cx4="http://schemas.microsoft.com/office/drawing/2016/5/10/chartex" xmlns:cx5="http://schemas.microsoft.com/office/drawing/2016/5/11/chartex" xmlns:cx6="http://schemas.microsoft.com/office/drawing/2016/5/12/chartex" xmlns:cx7="http://schemas.microsoft.com/office/drawing/2016/5/13/chartex" xmlns:cx8="http://schemas.microsoft.com/office/drawing/2016/5/14/chartex" xmlns:mc="http://schemas.openxmlformats.org/markup-compatibility/2006" xmlns:aink="http://schemas.microsoft.com/office/drawing/2016/ink" xmlns:am3d="http://schemas.microsoft.com/office/drawing/2017/model3d" xmlns:o="urn:schemas-microsoft-com:office:office" xmlns:oel="http://schemas.microsoft.com/office/2019/extlst" xmlns:r="http://schemas.openxmlformats.org/officeDocument/2006/relationships" xmlns:m="http://schemas.openxmlformats.org/officeDocument/2006/math" xmlns:v="urn:schemas-microsoft-com:vml" xmlns:wp14="http://schemas.microsoft.com/office/word/2010/wordprocessingDrawing" xmlns:wp="http://schemas.openxmlformats.org/drawingml/2006/wordprocessingDrawing" xmlns:w10="urn:schemas-microsoft-com:office:word" xmlns:w="http://schemas.openxmlformats.org/wordprocessingml/2006/main" xmlns:w14="http://schemas.microsoft.com/office/word/2010/wordml" xmlns:w15="http://schemas.microsoft.com/office/word/2012/wordml" xmlns:w16cex="http://schemas.microsoft.com/office/word/2018/wordml/cex" xmlns:w16cid="http://schemas.microsoft.com/office/word/2016/wordml/cid" xmlns:w16="http://schemas.microsoft.com/office/word/2018/wordml" xmlns:w16du="http://schemas.microsoft.com/office/word/2023/wordml/word16du" xmlns:w16sdtdh="http://schemas.microsoft.com/office/word/2020/wordml/sdtdatahash" xmlns:w16sdtfl="http://schemas.microsoft.com/office/word/2024/wordml/sdtformatlock" xmlns:w16se="http://schemas.microsoft.com/office/word/2015/wordml/symex" xmlns:wpg="http://schemas.microsoft.com/office/word/2010/wordprocessingGroup" xmlns:wpi="http://schemas.microsoft.com/office/word/2010/wordprocessingInk" xmlns:wne="http://schemas.microsoft.com/office/word/2006/wordml" xmlns:wps="http://schemas.microsoft.com/office/word/2010/wordprocessingShape" mc:Ignorable="w14 w15 w16se w16cid w16 w16cex w16sdtdh w16sdtfl w16du wp14">
   <w:footnote w:type="separator" w:id="-1">
     <w:p>
       <w:r>
@@ -9127,7 +9143,7 @@
 </file>
 
 <file path=word/header1.xml><?xml version="1.0" encoding="utf-8"?>
-<w:hdr xmlns:wpc="http://schemas.microsoft.com/office/word/2010/wordprocessingCanvas" xmlns:cx="http://schemas.microsoft.com/office/drawing/2014/chartex" xmlns:cx1="http://schemas.microsoft.com/office/drawing/2015/9/8/chartex" xmlns:cx2="http://schemas.microsoft.com/office/drawing/2015/10/21/chartex" xmlns:cx3="http://schemas.microsoft.com/office/drawing/2016/5/9/chartex" xmlns:cx4="http://schemas.microsoft.com/office/drawing/2016/5/10/chartex" xmlns:cx5="http://schemas.microsoft.com/office/drawing/2016/5/11/chartex" xmlns:cx6="http://schemas.microsoft.com/office/drawing/2016/5/12/chartex" xmlns:cx7="http://schemas.microsoft.com/office/drawing/2016/5/13/chartex" xmlns:cx8="http://schemas.microsoft.com/office/drawing/2016/5/14/chartex" xmlns:mc="http://schemas.openxmlformats.org/markup-compatibility/2006" xmlns:aink="http://schemas.microsoft.com/office/drawing/2016/ink" xmlns:am3d="http://schemas.microsoft.com/office/drawing/2017/model3d" xmlns:o="urn:schemas-microsoft-com:office:office" xmlns:oel="http://schemas.microsoft.com/office/2019/extlst" xmlns:r="http://schemas.openxmlformats.org/officeDocument/2006/relationships" xmlns:m="http://schemas.openxmlformats.org/officeDocument/2006/math" xmlns:v="urn:schemas-microsoft-com:vml" xmlns:wp14="http://schemas.microsoft.com/office/word/2010/wordprocessingDrawing" xmlns:wp="http://schemas.openxmlformats.org/drawingml/2006/wordprocessingDrawing" xmlns:w10="urn:schemas-microsoft-com:office:word" xmlns:w="http://schemas.openxmlformats.org/wordprocessingml/2006/main" xmlns:w14="http://schemas.microsoft.com/office/word/2010/wordml" xmlns:w15="http://schemas.microsoft.com/office/word/2012/wordml" xmlns:w16cex="http://schemas.microsoft.com/office/word/2018/wordml/cex" xmlns:w16cid="http://schemas.microsoft.com/office/word/2016/wordml/cid" xmlns:w16="http://schemas.microsoft.com/office/word/2018/wordml" xmlns:w16du="http://schemas.microsoft.com/office/word/2023/wordml/word16du" xmlns:w16sdtdh="http://schemas.microsoft.com/office/word/2020/wordml/sdtdatahash" xmlns:w16se="http://schemas.microsoft.com/office/word/2015/wordml/symex" xmlns:wpg="http://schemas.microsoft.com/office/word/2010/wordprocessingGroup" xmlns:wpi="http://schemas.microsoft.com/office/word/2010/wordprocessingInk" xmlns:wne="http://schemas.microsoft.com/office/word/2006/wordml" xmlns:wps="http://schemas.microsoft.com/office/word/2010/wordprocessingShape" mc:Ignorable="w14 w15 w16se w16cid w16 w16cex w16sdtdh w16du wp14">
+<w:hdr xmlns:wpc="http://schemas.microsoft.com/office/word/2010/wordprocessingCanvas" xmlns:cx="http://schemas.microsoft.com/office/drawing/2014/chartex" xmlns:cx1="http://schemas.microsoft.com/office/drawing/2015/9/8/chartex" xmlns:cx2="http://schemas.microsoft.com/office/drawing/2015/10/21/chartex" xmlns:cx3="http://schemas.microsoft.com/office/drawing/2016/5/9/chartex" xmlns:cx4="http://schemas.microsoft.com/office/drawing/2016/5/10/chartex" xmlns:cx5="http://schemas.microsoft.com/office/drawing/2016/5/11/chartex" xmlns:cx6="http://schemas.microsoft.com/office/drawing/2016/5/12/chartex" xmlns:cx7="http://schemas.microsoft.com/office/drawing/2016/5/13/chartex" xmlns:cx8="http://schemas.microsoft.com/office/drawing/2016/5/14/chartex" xmlns:mc="http://schemas.openxmlformats.org/markup-compatibility/2006" xmlns:aink="http://schemas.microsoft.com/office/drawing/2016/ink" xmlns:am3d="http://schemas.microsoft.com/office/drawing/2017/model3d" xmlns:o="urn:schemas-microsoft-com:office:office" xmlns:oel="http://schemas.microsoft.com/office/2019/extlst" xmlns:r="http://schemas.openxmlformats.org/officeDocument/2006/relationships" xmlns:m="http://schemas.openxmlformats.org/officeDocument/2006/math" xmlns:v="urn:schemas-microsoft-com:vml" xmlns:wp14="http://schemas.microsoft.com/office/word/2010/wordprocessingDrawing" xmlns:wp="http://schemas.openxmlformats.org/drawingml/2006/wordprocessingDrawing" xmlns:w10="urn:schemas-microsoft-com:office:word" xmlns:w="http://schemas.openxmlformats.org/wordprocessingml/2006/main" xmlns:w14="http://schemas.microsoft.com/office/word/2010/wordml" xmlns:w15="http://schemas.microsoft.com/office/word/2012/wordml" xmlns:w16cex="http://schemas.microsoft.com/office/word/2018/wordml/cex" xmlns:w16cid="http://schemas.microsoft.com/office/word/2016/wordml/cid" xmlns:w16="http://schemas.microsoft.com/office/word/2018/wordml" xmlns:w16du="http://schemas.microsoft.com/office/word/2023/wordml/word16du" xmlns:w16sdtdh="http://schemas.microsoft.com/office/word/2020/wordml/sdtdatahash" xmlns:w16sdtfl="http://schemas.microsoft.com/office/word/2024/wordml/sdtformatlock" xmlns:w16se="http://schemas.microsoft.com/office/word/2015/wordml/symex" xmlns:wpg="http://schemas.microsoft.com/office/word/2010/wordprocessingGroup" xmlns:wpi="http://schemas.microsoft.com/office/word/2010/wordprocessingInk" xmlns:wne="http://schemas.microsoft.com/office/word/2006/wordml" xmlns:wps="http://schemas.microsoft.com/office/word/2010/wordprocessingShape" mc:Ignorable="w14 w15 w16se w16cid w16 w16cex w16sdtdh w16sdtfl w16du wp14">
   <w:tbl>
     <w:tblPr>
       <w:tblStyle w:val="Tablaconcuadrcula"/>
@@ -9182,7 +9198,7 @@
 </file>
 
 <file path=word/header2.xml><?xml version="1.0" encoding="utf-8"?>
-<w:hdr xmlns:wpc="http://schemas.microsoft.com/office/word/2010/wordprocessingCanvas" xmlns:cx="http://schemas.microsoft.com/office/drawing/2014/chartex" xmlns:cx1="http://schemas.microsoft.com/office/drawing/2015/9/8/chartex" xmlns:cx2="http://schemas.microsoft.com/office/drawing/2015/10/21/chartex" xmlns:cx3="http://schemas.microsoft.com/office/drawing/2016/5/9/chartex" xmlns:cx4="http://schemas.microsoft.com/office/drawing/2016/5/10/chartex" xmlns:cx5="http://schemas.microsoft.com/office/drawing/2016/5/11/chartex" xmlns:cx6="http://schemas.microsoft.com/office/drawing/2016/5/12/chartex" xmlns:cx7="http://schemas.microsoft.com/office/drawing/2016/5/13/chartex" xmlns:cx8="http://schemas.microsoft.com/office/drawing/2016/5/14/chartex" xmlns:mc="http://schemas.openxmlformats.org/markup-compatibility/2006" xmlns:aink="http://schemas.microsoft.com/office/drawing/2016/ink" xmlns:am3d="http://schemas.microsoft.com/office/drawing/2017/model3d" xmlns:o="urn:schemas-microsoft-com:office:office" xmlns:oel="http://schemas.microsoft.com/office/2019/extlst" xmlns:r="http://schemas.openxmlformats.org/officeDocument/2006/relationships" xmlns:m="http://schemas.openxmlformats.org/officeDocument/2006/math" xmlns:v="urn:schemas-microsoft-com:vml" xmlns:wp14="http://schemas.microsoft.com/office/word/2010/wordprocessingDrawing" xmlns:wp="http://schemas.openxmlformats.org/drawingml/2006/wordprocessingDrawing" xmlns:w10="urn:schemas-microsoft-com:office:word" xmlns:w="http://schemas.openxmlformats.org/wordprocessingml/2006/main" xmlns:w14="http://schemas.microsoft.com/office/word/2010/wordml" xmlns:w15="http://schemas.microsoft.com/office/word/2012/wordml" xmlns:w16cex="http://schemas.microsoft.com/office/word/2018/wordml/cex" xmlns:w16cid="http://schemas.microsoft.com/office/word/2016/wordml/cid" xmlns:w16="http://schemas.microsoft.com/office/word/2018/wordml" xmlns:w16du="http://schemas.microsoft.com/office/word/2023/wordml/word16du" xmlns:w16sdtdh="http://schemas.microsoft.com/office/word/2020/wordml/sdtdatahash" xmlns:w16se="http://schemas.microsoft.com/office/word/2015/wordml/symex" xmlns:wpg="http://schemas.microsoft.com/office/word/2010/wordprocessingGroup" xmlns:wpi="http://schemas.microsoft.com/office/word/2010/wordprocessingInk" xmlns:wne="http://schemas.microsoft.com/office/word/2006/wordml" xmlns:wps="http://schemas.microsoft.com/office/word/2010/wordprocessingShape" mc:Ignorable="w14 w15 w16se w16cid w16 w16cex w16sdtdh w16du wp14">
+<w:hdr xmlns:wpc="http://schemas.microsoft.com/office/word/2010/wordprocessingCanvas" xmlns:cx="http://schemas.microsoft.com/office/drawing/2014/chartex" xmlns:cx1="http://schemas.microsoft.com/office/drawing/2015/9/8/chartex" xmlns:cx2="http://schemas.microsoft.com/office/drawing/2015/10/21/chartex" xmlns:cx3="http://schemas.microsoft.com/office/drawing/2016/5/9/chartex" xmlns:cx4="http://schemas.microsoft.com/office/drawing/2016/5/10/chartex" xmlns:cx5="http://schemas.microsoft.com/office/drawing/2016/5/11/chartex" xmlns:cx6="http://schemas.microsoft.com/office/drawing/2016/5/12/chartex" xmlns:cx7="http://schemas.microsoft.com/office/drawing/2016/5/13/chartex" xmlns:cx8="http://schemas.microsoft.com/office/drawing/2016/5/14/chartex" xmlns:mc="http://schemas.openxmlformats.org/markup-compatibility/2006" xmlns:aink="http://schemas.microsoft.com/office/drawing/2016/ink" xmlns:am3d="http://schemas.microsoft.com/office/drawing/2017/model3d" xmlns:o="urn:schemas-microsoft-com:office:office" xmlns:oel="http://schemas.microsoft.com/office/2019/extlst" xmlns:r="http://schemas.openxmlformats.org/officeDocument/2006/relationships" xmlns:m="http://schemas.openxmlformats.org/officeDocument/2006/math" xmlns:v="urn:schemas-microsoft-com:vml" xmlns:wp14="http://schemas.microsoft.com/office/word/2010/wordprocessingDrawing" xmlns:wp="http://schemas.openxmlformats.org/drawingml/2006/wordprocessingDrawing" xmlns:w10="urn:schemas-microsoft-com:office:word" xmlns:w="http://schemas.openxmlformats.org/wordprocessingml/2006/main" xmlns:w14="http://schemas.microsoft.com/office/word/2010/wordml" xmlns:w15="http://schemas.microsoft.com/office/word/2012/wordml" xmlns:w16cex="http://schemas.microsoft.com/office/word/2018/wordml/cex" xmlns:w16cid="http://schemas.microsoft.com/office/word/2016/wordml/cid" xmlns:w16="http://schemas.microsoft.com/office/word/2018/wordml" xmlns:w16du="http://schemas.microsoft.com/office/word/2023/wordml/word16du" xmlns:w16sdtdh="http://schemas.microsoft.com/office/word/2020/wordml/sdtdatahash" xmlns:w16sdtfl="http://schemas.microsoft.com/office/word/2024/wordml/sdtformatlock" xmlns:w16se="http://schemas.microsoft.com/office/word/2015/wordml/symex" xmlns:wpg="http://schemas.microsoft.com/office/word/2010/wordprocessingGroup" xmlns:wpi="http://schemas.microsoft.com/office/word/2010/wordprocessingInk" xmlns:wne="http://schemas.microsoft.com/office/word/2006/wordml" xmlns:wps="http://schemas.microsoft.com/office/word/2010/wordprocessingShape" mc:Ignorable="w14 w15 w16se w16cid w16 w16cex w16sdtdh w16sdtfl w16du wp14">
   <w:p>
     <w:pPr>
       <w:pStyle w:val="Encabezado"/>
@@ -9431,7 +9447,7 @@
 </file>
 
 <file path=word/numbering.xml><?xml version="1.0" encoding="utf-8"?>
-<w:numbering xmlns:wpc="http://schemas.microsoft.com/office/word/2010/wordprocessingCanvas" xmlns:cx="http://schemas.microsoft.com/office/drawing/2014/chartex" xmlns:cx1="http://schemas.microsoft.com/office/drawing/2015/9/8/chartex" xmlns:cx2="http://schemas.microsoft.com/office/drawing/2015/10/21/chartex" xmlns:cx3="http://schemas.microsoft.com/office/drawing/2016/5/9/chartex" xmlns:cx4="http://schemas.microsoft.com/office/drawing/2016/5/10/chartex" xmlns:cx5="http://schemas.microsoft.com/office/drawing/2016/5/11/chartex" xmlns:cx6="http://schemas.microsoft.com/office/drawing/2016/5/12/chartex" xmlns:cx7="http://schemas.microsoft.com/office/drawing/2016/5/13/chartex" xmlns:cx8="http://schemas.microsoft.com/office/drawing/2016/5/14/chartex" xmlns:mc="http://schemas.openxmlformats.org/markup-compatibility/2006" xmlns:aink="http://schemas.microsoft.com/office/drawing/2016/ink" xmlns:am3d="http://schemas.microsoft.com/office/drawing/2017/model3d" xmlns:o="urn:schemas-microsoft-com:office:office" xmlns:oel="http://schemas.microsoft.com/office/2019/extlst" xmlns:r="http://schemas.openxmlformats.org/officeDocument/2006/relationships" xmlns:m="http://schemas.openxmlformats.org/officeDocument/2006/math" xmlns:v="urn:schemas-microsoft-com:vml" xmlns:wp14="http://schemas.microsoft.com/office/word/2010/wordprocessingDrawing" xmlns:wp="http://schemas.openxmlformats.org/drawingml/2006/wordprocessingDrawing" xmlns:w10="urn:schemas-microsoft-com:office:word" xmlns:w="http://schemas.openxmlformats.org/wordprocessingml/2006/main" xmlns:w14="http://schemas.microsoft.com/office/word/2010/wordml" xmlns:w15="http://schemas.microsoft.com/office/word/2012/wordml" xmlns:w16cex="http://schemas.microsoft.com/office/word/2018/wordml/cex" xmlns:w16cid="http://schemas.microsoft.com/office/word/2016/wordml/cid" xmlns:w16="http://schemas.microsoft.com/office/word/2018/wordml" xmlns:w16du="http://schemas.microsoft.com/office/word/2023/wordml/word16du" xmlns:w16sdtdh="http://schemas.microsoft.com/office/word/2020/wordml/sdtdatahash" xmlns:w16se="http://schemas.microsoft.com/office/word/2015/wordml/symex" xmlns:wpg="http://schemas.microsoft.com/office/word/2010/wordprocessingGroup" xmlns:wpi="http://schemas.microsoft.com/office/word/2010/wordprocessingInk" xmlns:wne="http://schemas.microsoft.com/office/word/2006/wordml" xmlns:wps="http://schemas.microsoft.com/office/word/2010/wordprocessingShape" mc:Ignorable="w14 w15 w16se w16cid w16 w16cex w16sdtdh w16du wp14">
+<w:numbering xmlns:wpc="http://schemas.microsoft.com/office/word/2010/wordprocessingCanvas" xmlns:cx="http://schemas.microsoft.com/office/drawing/2014/chartex" xmlns:cx1="http://schemas.microsoft.com/office/drawing/2015/9/8/chartex" xmlns:cx2="http://schemas.microsoft.com/office/drawing/2015/10/21/chartex" xmlns:cx3="http://schemas.microsoft.com/office/drawing/2016/5/9/chartex" xmlns:cx4="http://schemas.microsoft.com/office/drawing/2016/5/10/chartex" xmlns:cx5="http://schemas.microsoft.com/office/drawing/2016/5/11/chartex" xmlns:cx6="http://schemas.microsoft.com/office/drawing/2016/5/12/chartex" xmlns:cx7="http://schemas.microsoft.com/office/drawing/2016/5/13/chartex" xmlns:cx8="http://schemas.microsoft.com/office/drawing/2016/5/14/chartex" xmlns:mc="http://schemas.openxmlformats.org/markup-compatibility/2006" xmlns:aink="http://schemas.microsoft.com/office/drawing/2016/ink" xmlns:am3d="http://schemas.microsoft.com/office/drawing/2017/model3d" xmlns:o="urn:schemas-microsoft-com:office:office" xmlns:oel="http://schemas.microsoft.com/office/2019/extlst" xmlns:r="http://schemas.openxmlformats.org/officeDocument/2006/relationships" xmlns:m="http://schemas.openxmlformats.org/officeDocument/2006/math" xmlns:v="urn:schemas-microsoft-com:vml" xmlns:wp14="http://schemas.microsoft.com/office/word/2010/wordprocessingDrawing" xmlns:wp="http://schemas.openxmlformats.org/drawingml/2006/wordprocessingDrawing" xmlns:w10="urn:schemas-microsoft-com:office:word" xmlns:w="http://schemas.openxmlformats.org/wordprocessingml/2006/main" xmlns:w14="http://schemas.microsoft.com/office/word/2010/wordml" xmlns:w15="http://schemas.microsoft.com/office/word/2012/wordml" xmlns:w16cex="http://schemas.microsoft.com/office/word/2018/wordml/cex" xmlns:w16cid="http://schemas.microsoft.com/office/word/2016/wordml/cid" xmlns:w16="http://schemas.microsoft.com/office/word/2018/wordml" xmlns:w16du="http://schemas.microsoft.com/office/word/2023/wordml/word16du" xmlns:w16sdtdh="http://schemas.microsoft.com/office/word/2020/wordml/sdtdatahash" xmlns:w16sdtfl="http://schemas.microsoft.com/office/word/2024/wordml/sdtformatlock" xmlns:w16se="http://schemas.microsoft.com/office/word/2015/wordml/symex" xmlns:wpg="http://schemas.microsoft.com/office/word/2010/wordprocessingGroup" xmlns:wpi="http://schemas.microsoft.com/office/word/2010/wordprocessingInk" xmlns:wne="http://schemas.microsoft.com/office/word/2006/wordml" xmlns:wps="http://schemas.microsoft.com/office/word/2010/wordprocessingShape" mc:Ignorable="w14 w15 w16se w16cid w16 w16cex w16sdtdh w16sdtfl w16du wp14">
   <w:abstractNum w:abstractNumId="0" w15:restartNumberingAfterBreak="0">
     <w:nsid w:val="FFFFFF7C"/>
     <w:multiLevelType w:val="singleLevel"/>
@@ -10819,7 +10835,7 @@
 </file>
 
 <file path=word/styles.xml><?xml version="1.0" encoding="utf-8"?>
-<w:styles xmlns:mc="http://schemas.openxmlformats.org/markup-compatibility/2006" xmlns:r="http://schemas.openxmlformats.org/officeDocument/2006/relationships" xmlns:w="http://schemas.openxmlformats.org/wordprocessingml/2006/main" xmlns:w14="http://schemas.microsoft.com/office/word/2010/wordml" xmlns:w15="http://schemas.microsoft.com/office/word/2012/wordml" xmlns:w16cex="http://schemas.microsoft.com/office/word/2018/wordml/cex" xmlns:w16cid="http://schemas.microsoft.com/office/word/2016/wordml/cid" xmlns:w16="http://schemas.microsoft.com/office/word/2018/wordml" xmlns:w16du="http://schemas.microsoft.com/office/word/2023/wordml/word16du" xmlns:w16sdtdh="http://schemas.microsoft.com/office/word/2020/wordml/sdtdatahash" xmlns:w16se="http://schemas.microsoft.com/office/word/2015/wordml/symex" mc:Ignorable="w14 w15 w16se w16cid w16 w16cex w16sdtdh w16du">
+<w:styles xmlns:mc="http://schemas.openxmlformats.org/markup-compatibility/2006" xmlns:r="http://schemas.openxmlformats.org/officeDocument/2006/relationships" xmlns:w="http://schemas.openxmlformats.org/wordprocessingml/2006/main" xmlns:w14="http://schemas.microsoft.com/office/word/2010/wordml" xmlns:w15="http://schemas.microsoft.com/office/word/2012/wordml" xmlns:w16cex="http://schemas.microsoft.com/office/word/2018/wordml/cex" xmlns:w16cid="http://schemas.microsoft.com/office/word/2016/wordml/cid" xmlns:w16="http://schemas.microsoft.com/office/word/2018/wordml" xmlns:w16du="http://schemas.microsoft.com/office/word/2023/wordml/word16du" xmlns:w16sdtdh="http://schemas.microsoft.com/office/word/2020/wordml/sdtdatahash" xmlns:w16sdtfl="http://schemas.microsoft.com/office/word/2024/wordml/sdtformatlock" xmlns:w16se="http://schemas.microsoft.com/office/word/2015/wordml/symex" mc:Ignorable="w14 w15 w16se w16cid w16 w16cex w16sdtdh w16sdtfl w16du">
   <w:docDefaults>
     <w:rPrDefault>
       <w:rPr>
@@ -12628,19 +12644,19 @@
       <w:szCs w:val="20"/>
     </w:rPr>
   </w:style>
-  <w:style w:type="paragraph" w:styleId="Firmadecorreo">
+  <w:style w:type="paragraph" w:styleId="Firmadecorreoelectrnico">
     <w:name w:val="E-mail Signature"/>
     <w:basedOn w:val="Normal"/>
-    <w:link w:val="FirmadecorreoCar"/>
+    <w:link w:val="FirmadecorreoelectrnicoCar"/>
     <w:uiPriority w:val="99"/>
     <w:semiHidden/>
     <w:unhideWhenUsed/>
     <w:rsid w:val="000A2485"/>
   </w:style>
-  <w:style w:type="character" w:customStyle="1" w:styleId="FirmadecorreoCar">
-    <w:name w:val="Firma de correo Car"/>
+  <w:style w:type="character" w:customStyle="1" w:styleId="FirmadecorreoelectrnicoCar">
+    <w:name w:val="Firma de correo electrónico Car"/>
     <w:basedOn w:val="Fuentedeprrafopredeter"/>
-    <w:link w:val="Firmadecorreo"/>
+    <w:link w:val="Firmadecorreoelectrnico"/>
     <w:uiPriority w:val="99"/>
     <w:semiHidden/>
     <w:rsid w:val="000A2485"/>
@@ -13774,6 +13790,10 @@
 </file>
 
 <file path=customXml/item1.xml><?xml version="1.0" encoding="utf-8"?>
+<b:Sources xmlns:b="http://schemas.openxmlformats.org/officeDocument/2006/bibliography" xmlns="http://schemas.openxmlformats.org/officeDocument/2006/bibliography" SelectedStyle="\APA.XSL" StyleName="APA"/>
+</file>
+
+<file path=customXml/item2.xml><?xml version="1.0" encoding="utf-8"?>
 <p:properties xmlns:p="http://schemas.microsoft.com/office/2006/metadata/properties" xmlns:xsi="http://www.w3.org/2001/XMLSchema-instance">
   <documentManagement>
     <lcf76f155ced4ddcb4097134ff3c332f xmlns="a96d7c79-e417-43c8-b247-a9bea165cf53">
@@ -13784,11 +13804,16 @@
 </p:properties>
 </file>
 
-<file path=customXml/item2.xml><?xml version="1.0" encoding="utf-8"?>
-<b:Sources xmlns:b="http://schemas.openxmlformats.org/officeDocument/2006/bibliography" xmlns="http://schemas.openxmlformats.org/officeDocument/2006/bibliography" SelectedStyle="\APA.XSL" StyleName="APA"/>
+<file path=customXml/item3.xml><?xml version="1.0" encoding="utf-8"?>
+<?mso-contentType ?>
+<FormTemplates xmlns="http://schemas.microsoft.com/sharepoint/v3/contenttype/forms">
+  <Display>DocumentLibraryForm</Display>
+  <Edit>DocumentLibraryForm</Edit>
+  <New>DocumentLibraryForm</New>
+</FormTemplates>
 </file>
 
-<file path=customXml/item3.xml><?xml version="1.0" encoding="utf-8"?>
+<file path=customXml/item4.xml><?xml version="1.0" encoding="utf-8"?>
 <ct:contentTypeSchema xmlns:ct="http://schemas.microsoft.com/office/2006/metadata/contentType" xmlns:ma="http://schemas.microsoft.com/office/2006/metadata/properties/metaAttributes" ct:_="" ma:_="" ma:contentTypeName="Document" ma:contentTypeID="0x010100A21F4A21D4678D499B82472BD06746BF" ma:contentTypeVersion="13" ma:contentTypeDescription="Create a new document." ma:contentTypeScope="" ma:versionID="f3c8b4d22ec823cc76163c46de3df5c8">
   <xsd:schema xmlns:xsd="http://www.w3.org/2001/XMLSchema" xmlns:xs="http://www.w3.org/2001/XMLSchema" xmlns:p="http://schemas.microsoft.com/office/2006/metadata/properties" xmlns:ns2="a96d7c79-e417-43c8-b247-a9bea165cf53" xmlns:ns3="5a62f564-6c95-44c7-9852-f816516ef194" targetNamespace="http://schemas.microsoft.com/office/2006/metadata/properties" ma:root="true" ma:fieldsID="f534863a24fac4f8203974ffe0da04ca" ns2:_="" ns3:_="">
     <xsd:import namespace="a96d7c79-e417-43c8-b247-a9bea165cf53"/>
@@ -14011,16 +14036,15 @@
 </ct:contentTypeSchema>
 </file>
 
-<file path=customXml/item4.xml><?xml version="1.0" encoding="utf-8"?>
-<?mso-contentType ?>
-<FormTemplates xmlns="http://schemas.microsoft.com/sharepoint/v3/contenttype/forms">
-  <Display>DocumentLibraryForm</Display>
-  <Edit>DocumentLibraryForm</Edit>
-  <New>DocumentLibraryForm</New>
-</FormTemplates>
+<file path=customXml/itemProps1.xml><?xml version="1.0" encoding="utf-8"?>
+<ds:datastoreItem xmlns:ds="http://schemas.openxmlformats.org/officeDocument/2006/customXml" ds:itemID="{E6B46028-D2F7-4AF4-9E70-087825343A45}">
+  <ds:schemaRefs>
+    <ds:schemaRef ds:uri="http://schemas.openxmlformats.org/officeDocument/2006/bibliography"/>
+  </ds:schemaRefs>
+</ds:datastoreItem>
 </file>
 
-<file path=customXml/itemProps1.xml><?xml version="1.0" encoding="utf-8"?>
+<file path=customXml/itemProps2.xml><?xml version="1.0" encoding="utf-8"?>
 <ds:datastoreItem xmlns:ds="http://schemas.openxmlformats.org/officeDocument/2006/customXml" ds:itemID="{E77F544A-CE7D-4D6F-8580-BD72B3D3E929}">
   <ds:schemaRefs>
     <ds:schemaRef ds:uri="http://schemas.microsoft.com/office/2006/metadata/properties"/>
@@ -14031,15 +14055,15 @@
 </ds:datastoreItem>
 </file>
 
-<file path=customXml/itemProps2.xml><?xml version="1.0" encoding="utf-8"?>
-<ds:datastoreItem xmlns:ds="http://schemas.openxmlformats.org/officeDocument/2006/customXml" ds:itemID="{E6B46028-D2F7-4AF4-9E70-087825343A45}">
+<file path=customXml/itemProps3.xml><?xml version="1.0" encoding="utf-8"?>
+<ds:datastoreItem xmlns:ds="http://schemas.openxmlformats.org/officeDocument/2006/customXml" ds:itemID="{E9307DF0-3AC8-4F54-B40D-28CE5F7A0EB6}">
   <ds:schemaRefs>
-    <ds:schemaRef ds:uri="http://schemas.openxmlformats.org/officeDocument/2006/bibliography"/>
+    <ds:schemaRef ds:uri="http://schemas.microsoft.com/sharepoint/v3/contenttype/forms"/>
   </ds:schemaRefs>
 </ds:datastoreItem>
 </file>
 
-<file path=customXml/itemProps3.xml><?xml version="1.0" encoding="utf-8"?>
+<file path=customXml/itemProps4.xml><?xml version="1.0" encoding="utf-8"?>
 <ds:datastoreItem xmlns:ds="http://schemas.openxmlformats.org/officeDocument/2006/customXml" ds:itemID="{F581A552-6BA8-4F0D-824D-C94E04369C43}">
   <ds:schemaRefs>
     <ds:schemaRef ds:uri="http://schemas.microsoft.com/office/2006/metadata/contentType"/>
@@ -14056,12 +14080,4 @@
     <ds:schemaRef ds:uri="http://schemas.microsoft.com/internal/obd"/>
   </ds:schemaRefs>
 </ds:datastoreItem>
-</file>
-
-<file path=customXml/itemProps4.xml><?xml version="1.0" encoding="utf-8"?>
-<ds:datastoreItem xmlns:ds="http://schemas.openxmlformats.org/officeDocument/2006/customXml" ds:itemID="{E9307DF0-3AC8-4F54-B40D-28CE5F7A0EB6}">
-  <ds:schemaRefs>
-    <ds:schemaRef ds:uri="http://schemas.microsoft.com/sharepoint/v3/contenttype/forms"/>
-  </ds:schemaRefs>
-</ds:datastoreItem>
 </file>
</xml_diff>